<commit_message>
Add the AI agent onboarding and consulting track
A new top-level `consulting` section, rendered in all five outputs: a dated
list in the English CV and web CV, section 8 of the Korean 이력서 (later
sections renumbered), and one compressed line in the résumé.

Six engagements, three of them documented down to the date:

- HSMU, 2026.07- : ongoing agent-driven automation of IR reporting and course
  CQI (repos hsmu-cqi-automation, hsmu-ir-dashboard)
- HSMU all-staff summer workshop, 2026.07.14: keynote on automating everyday
  work with AI agents (schedule PDF names the slot and the speaker)
- Sae-Seoul CBMC, 2026.07.31: 1393rd meeting, from the event poster
- Wecruit, 2026.08.06: corporate lecture, ~15 attendees
- Zespa and TheAstory: year only so far

Speaker fees were deliberately left out — payment terms are not CV content.

Also links the Makers club to its site, and teaches the outreach renderers to
emit a URL when one is present.

Co-Authored-By: Claude Opus 5 <noreply@anthropic.com>
</commit_message>
<xml_diff>
--- a/build/CV_SunwhiKim.docx
+++ b/build/CV_SunwhiKim.docx
@@ -1915,6 +1915,90 @@
           <w:b/>
           <w:sz w:val="22"/>
         </w:rPr>
+        <w:t>AI AGENT ONBOARDING &amp; CONSULTING</w:t>
+      </w:r>
+    </w:p>
+    <w:p>
+      <w:pPr>
+        <w:pStyle w:val="ListBullet"/>
+        <w:spacing w:after="40"/>
+      </w:pPr>
+      <w:r>
+        <w:rPr>
+          <w:sz w:val="19"/>
+        </w:rPr>
+        <w:t>2026.07– — Hwasung Medi-Science University, Institutional automation programme (ongoing): AI-agent-driven automation of institutional research (IR) reporting and course-level CQI workflows</w:t>
+      </w:r>
+    </w:p>
+    <w:p>
+      <w:pPr>
+        <w:pStyle w:val="ListBullet"/>
+        <w:spacing w:after="40"/>
+      </w:pPr>
+      <w:r>
+        <w:rPr>
+          <w:sz w:val="19"/>
+        </w:rPr>
+        <w:t>2026.08.06 — Wecruit, Invited corporate lecture: What AI agents are and what they make possible</w:t>
+      </w:r>
+    </w:p>
+    <w:p>
+      <w:pPr>
+        <w:pStyle w:val="ListBullet"/>
+        <w:spacing w:after="40"/>
+      </w:pPr>
+      <w:r>
+        <w:rPr>
+          <w:sz w:val="19"/>
+        </w:rPr>
+        <w:t>2026.07.31 — Sae-Seoul CBMC, Invited lecture: What AI agents are and what they make possible: using AI in a small business, and the wisdom of stewardship</w:t>
+      </w:r>
+    </w:p>
+    <w:p>
+      <w:pPr>
+        <w:pStyle w:val="ListBullet"/>
+        <w:spacing w:after="40"/>
+      </w:pPr>
+      <w:r>
+        <w:rPr>
+          <w:sz w:val="19"/>
+        </w:rPr>
+        <w:t>2026.07.14 — Hwasung Medi-Science University, Keynote, all-staff summer workshop: Automating everyday work with AI agents</w:t>
+      </w:r>
+    </w:p>
+    <w:p>
+      <w:pPr>
+        <w:pStyle w:val="ListBullet"/>
+        <w:spacing w:after="40"/>
+      </w:pPr>
+      <w:r>
+        <w:rPr>
+          <w:sz w:val="19"/>
+        </w:rPr>
+        <w:t>2026 — Zespa, Lecture, workshop and consulting: AI agent onboarding for business operations</w:t>
+      </w:r>
+    </w:p>
+    <w:p>
+      <w:pPr>
+        <w:pStyle w:val="ListBullet"/>
+        <w:spacing w:after="40"/>
+      </w:pPr>
+      <w:r>
+        <w:rPr>
+          <w:sz w:val="19"/>
+        </w:rPr>
+        <w:t>2026 — TheAstory, Lecture, workshop and consulting: AI agent onboarding for business operations</w:t>
+      </w:r>
+    </w:p>
+    <w:p>
+      <w:pPr>
+        <w:spacing w:before="240" w:after="80"/>
+      </w:pPr>
+      <w:r>
+        <w:rPr>
+          <w:b/>
+          <w:sz w:val="22"/>
+        </w:rPr>
         <w:t>MENTORING</w:t>
       </w:r>
     </w:p>

</xml_diff>

<commit_message>
Date the Zespa and TheAstory engagements; sort consulting automatically
Zespa was June 2026, TheAstory August 2026. Exact days and talk titles are
still open, so both keep a TODO.

Rather than hand-order the list, consulting now sorts the way publications
already do: ongoing engagements first, then newest-first. Month-only dates
sort to the start of their month, so 2026.08 sits above 2026.08.06 without
pretending to a precision the source does not have. Appending a new engagement
anywhere in cv.yaml now lands it in the right place.

Co-Authored-By: Claude Opus 5 <noreply@anthropic.com>
</commit_message>
<xml_diff>
--- a/build/CV_SunwhiKim.docx
+++ b/build/CV_SunwhiKim.docx
@@ -1951,6 +1951,18 @@
         <w:rPr>
           <w:sz w:val="19"/>
         </w:rPr>
+        <w:t>2026.08 — TheAstory, Lecture, workshop and consulting: AI agent onboarding for business operations</w:t>
+      </w:r>
+    </w:p>
+    <w:p>
+      <w:pPr>
+        <w:pStyle w:val="ListBullet"/>
+        <w:spacing w:after="40"/>
+      </w:pPr>
+      <w:r>
+        <w:rPr>
+          <w:sz w:val="19"/>
+        </w:rPr>
         <w:t>2026.07.31 — Sae-Seoul CBMC, Invited lecture: What AI agents are and what they make possible: using AI in a small business, and the wisdom of stewardship</w:t>
       </w:r>
     </w:p>
@@ -1975,19 +1987,7 @@
         <w:rPr>
           <w:sz w:val="19"/>
         </w:rPr>
-        <w:t>2026 — Zespa, Lecture, workshop and consulting: AI agent onboarding for business operations</w:t>
-      </w:r>
-    </w:p>
-    <w:p>
-      <w:pPr>
-        <w:pStyle w:val="ListBullet"/>
-        <w:spacing w:after="40"/>
-      </w:pPr>
-      <w:r>
-        <w:rPr>
-          <w:sz w:val="19"/>
-        </w:rPr>
-        <w:t>2026 — TheAstory, Lecture, workshop and consulting: AI agent onboarding for business operations</w:t>
+        <w:t>2026.06 — Zespa, Lecture, workshop and consulting: AI agent onboarding for business operations</w:t>
       </w:r>
     </w:p>
     <w:p>

</xml_diff>